<commit_message>
docs: remove copy-paste artifacts from Pitch and Documentation files
</commit_message>
<xml_diff>
--- a/Documentation CZ/Pitch CZ 5.0.docx
+++ b/Documentation CZ/Pitch CZ 5.0.docx
@@ -81,12 +81,7 @@
         <w:t>Byznysová hodnota: týmy zodpovědné za kapacitní plánování a kampaně mohou identifikovat optimální časy pro propagační akce a předvídat okna s vysokým provozem.</w:t>
         <w:br/>
         <w:br/>
-        <w:t>4.  Kvalita dat &amp; governance ve velkém měřítku predikci. Označuje zaměstnance nebo produkty, kteří se výrazně odchylují od svého historického průměru, a zapisuje upozornění do dedikované Snowflake tabulky.</w:t>
-      </w:r>
-    </w:p>
-    <w:p>
-      <w:r>
-        <w:t>Byznysová hodnota: operační týmy dostávají včasné varování před poklesem výkonu prodeje nebo konverzí — reagují ve dnech místo týdnů.</w:t>
+        <w:t>4.  Kvalita dat &amp; governance</w:t>
       </w:r>
     </w:p>
     <w:p>

</xml_diff>